<commit_message>
Update checklist, Word plan, and Excel finance sheet to match Vang My restaurant and pilot event parameters
</commit_message>
<xml_diff>
--- a/Plan/Tram Hen Ho Hai Phong - Ke hoach & Checklist.docx
+++ b/Plan/Tram Hen Ho Hai Phong - Ke hoach & Checklist.docx
@@ -30,7 +30,7 @@
         </w:rPr>
         <w:t>KẾ HOẠCH TỔ CHỨC SỰ KIỆN &amp; CHECKLIST CHI TIẾT</w:t>
         <w:br/>
-        <w:t>(Tối ưu hóa cho quy mô thử nghiệm 20 người)</w:t>
+        <w:t>(Tối ưu hóa cho quy mô thử nghiệm 20 người tại Nhà hàng Vang My)</w:t>
       </w:r>
     </w:p>
     <w:p>
@@ -46,6 +46,8 @@
         <w:t>Đơn vị xây dựng: Dating Station (datingstation.vn)</w:t>
         <w:br/>
         <w:t>Thị trường triển khai: Hải Phòng</w:t>
+        <w:br/>
+        <w:t>Đối tác địa điểm: Nhà hàng Vang My</w:t>
         <w:br/>
         <w:t>Thời gian lập: Tháng 7/2026</w:t>
       </w:r>
@@ -537,7 +539,7 @@
         <w:br/>
       </w:r>
       <w:r>
-        <w:t>Mỗi cặp đôi có 7-8 phút trò chuyện riêng tư tại bàn đôi. Hết giờ, nam di chuyển xoay vòng sang bàn tiếp theo. Sử dụng Match Card bí mật. Phù hợp tổ chức tại phòng VIP của Lounge/Cafe sang trọng để đảm bảo khoảng cách riêng tư giữa các bàn.</w:t>
+        <w:t>Mỗi cặp đôi có 7-8 phút trò chuyện riêng tư tại bàn đôi. Hết giờ, nam di chuyển xoay vòng sang bàn tiếp theo. Sử dụng Match Card bí mật. Tổ chức tại không gian riêng tư được bao trọn của đối tác Nhà hàng Vang My để đảm bảo khoảng cách riêng tư và sang trọng.</w:t>
       </w:r>
     </w:p>
     <w:p>
@@ -586,7 +588,7 @@
           <w:color w:val="B42846"/>
           <w:sz w:val="32"/>
         </w:rPr>
-        <w:t>5. Địa điểm Gợi ý tại Hải Phòng</w:t>
+        <w:t>5. Đối tác Địa điểm chính thức tại Hải Phòng</w:t>
       </w:r>
     </w:p>
     <w:p>
@@ -594,7 +596,7 @@
         <w:spacing w:after="120"/>
       </w:pPr>
       <w:r>
-        <w:t>Yêu cầu địa điểm: Sang trọng, riêng tư, trung tâm và có chỗ đỗ xe ô tô thuận tiện.</w:t>
+        <w:t>Địa điểm chính thức được lựa chọn cho số pilot đầu tiên tại Hải Phòng:</w:t>
       </w:r>
     </w:p>
     <w:p>
@@ -606,40 +608,10 @@
         <w:rPr>
           <w:b/>
         </w:rPr>
-        <w:t xml:space="preserve">Khu vực Vinhomes Imperia / Thượng Lý: </w:t>
+        <w:t xml:space="preserve">Nhà hàng Vang My (Vang My Restaurant): </w:t>
       </w:r>
       <w:r>
-        <w:t>Tập trung nhiều quán Lounge/Cafe phân khúc cao cấp, đỗ xe thuận tiện, không gian biệt lập. Phù hợp cho tệp khách trẻ, doanh nhân.</w:t>
-      </w:r>
-    </w:p>
-    <w:p>
-      <w:pPr>
-        <w:pStyle w:val="ListBullet"/>
-        <w:spacing w:after="80"/>
-      </w:pPr>
-      <w:r>
-        <w:rPr>
-          <w:b/>
-        </w:rPr>
-        <w:t xml:space="preserve">Trục đường trung tâm Lạch Tray / An Đà / Lê Hồng Phong: </w:t>
-      </w:r>
-      <w:r>
-        <w:t>Thuận tiện di chuyển. Ưu tiên các Speakeasy Bar ẩn mình để tổ chức Blind Dating buổi tối nhằm tạo không gian ấm cúng, lãng mạn.</w:t>
-      </w:r>
-    </w:p>
-    <w:p>
-      <w:pPr>
-        <w:pStyle w:val="ListBullet"/>
-        <w:spacing w:after="80"/>
-      </w:pPr>
-      <w:r>
-        <w:rPr>
-          <w:b/>
-        </w:rPr>
-        <w:t xml:space="preserve">Khách sạn 5 sao (Sheraton, Mercure, Avani): </w:t>
-      </w:r>
-      <w:r>
-        <w:t>Thuê phòng VIP nhỏ hoặc Executive Lounge để phục vụ riêng cho tệp khách hàng VIP (High-end Matchmaking).</w:t>
+        <w:t>Địa điểm sang trọng, trung tâm, không gian thiết kế ấm cúng, riêng tư cực kỳ phù hợp với Speed Dating. BTC liên kết thuê phòng VIP/khu vực riêng để đảm bảo sự yên tĩnh tuyệt đối cho 10 cặp đôi. Cung cấp gói F&amp;B (Welcome drink &amp; Teabreak) chất lượng cao.</w:t>
       </w:r>
     </w:p>
     <w:p>
@@ -671,7 +643,7 @@
           <w:b/>
           <w:color w:val="B42846"/>
         </w:rPr>
-        <w:t>GIAI ĐOẠN 1: CHUẨN BỊ NỀN TẢNG (Tuần 1 - Tuần 2)</w:t>
+        <w:t>GIAI ĐOẠN 1: CHUẨN BỊ NỀN TẢNG &amp; LIÊN KẾT ĐỐI TÁC (Tuần 1 - Tuần 2)</w:t>
       </w:r>
     </w:p>
     <w:p>
@@ -686,7 +658,7 @@
         <w:t xml:space="preserve">☐  </w:t>
       </w:r>
       <w:r>
-        <w:t>Xây dựng Form đăng ký chi tiết (Họ tên, SĐT, Facebook/Instagram, nghề nghiệp, thu nhập, hình mẫu lý tưởng).</w:t>
+        <w:t>Thiết kế Landing Page sự kiện giới thiệu chương trình tại Hải Phòng và Nhà hàng Vang My.</w:t>
       </w:r>
     </w:p>
     <w:p>
@@ -701,7 +673,7 @@
         <w:t xml:space="preserve">☐  </w:t>
       </w:r>
       <w:r>
-        <w:t>Thiết kế bảng tiêu chí sàng lọc hồ sơ đầu vào và bảng câu hỏi quan điểm sống để hỗ trợ Pre-matching.</w:t>
+        <w:t>Thiết lập Google Form đăng ký thu thập thông tin chi tiết (SĐT, Facebook/Instagram, nghề nghiệp, hình mẫu lý tưởng, sàng lọc tính cách).</w:t>
       </w:r>
     </w:p>
     <w:p>
@@ -716,7 +688,7 @@
         <w:t xml:space="preserve">☐  </w:t>
       </w:r>
       <w:r>
-        <w:t>Thiết kế nhận diện truyền thông 'Trạm Hẹn Hải Phòng - Số đầu tiên'.</w:t>
+        <w:t>Chuẩn hóa quy trình Thanh toán trước (Prepayment) chuyển khoản vào STK của BTC để xác nhận đặt chỗ.</w:t>
       </w:r>
     </w:p>
     <w:p>
@@ -731,7 +703,7 @@
         <w:t xml:space="preserve">☐  </w:t>
       </w:r>
       <w:r>
-        <w:t>Thiết kế và in ấn Match Card (phiếu ghép đôi) và bộ Prompt Cards (thẻ câu hỏi gợi ý tại bàn).</w:t>
+        <w:t>Làm việc với Nhà hàng Vang My: Thống nhất chi phí thuê trọn gói khu riêng biệt và chốt gói dịch vụ F&amp;B (Teabreak + nước uống).</w:t>
       </w:r>
     </w:p>
     <w:p>
@@ -746,19 +718,7 @@
         <w:t xml:space="preserve">☐  </w:t>
       </w:r>
       <w:r>
-        <w:t>Khảo sát địa điểm: Đặt phòng VIP hoặc Lounge nhỏ sức chứa ~25 người tại Hải Phòng (ngân sách thuê ~2.000.000 VNĐ).</w:t>
-      </w:r>
-    </w:p>
-    <w:p>
-      <w:pPr>
-        <w:spacing w:before="160" w:after="80"/>
-      </w:pPr>
-      <w:r>
-        <w:rPr>
-          <w:b/>
-          <w:color w:val="B42846"/>
-        </w:rPr>
-        <w:t>GIAI ĐOẠN 2: MARKETING &amp; TUYỂN SINH (Tuần 3 - Tuần 4)</w:t>
+        <w:t>Bố trí layout không gian: Sơ đồ 10 bàn đôi khoảng cách 1.5m - 2m, bàn check-in, vị trí MC, âm thanh ánh sáng.</w:t>
       </w:r>
     </w:p>
     <w:p>
@@ -773,7 +733,7 @@
         <w:t xml:space="preserve">☐  </w:t>
       </w:r>
       <w:r>
-        <w:t>Đăng bài truyền thông và chạy quảng cáo Facebook Ads định vị Hải Phòng.</w:t>
+        <w:t>Thiết kế và in ấn ấn phẩm: Poster co-branding, Match Card (phiếu ghép đôi), Prompt Cards (thẻ câu hỏi gợi ý).</w:t>
       </w:r>
     </w:p>
     <w:p>
@@ -788,7 +748,19 @@
         <w:t xml:space="preserve">☐  </w:t>
       </w:r>
       <w:r>
-        <w:t>Đặt mục tiêu thu hút 60-80 đơn đăng ký để lọc lấy 20 ứng viên xuất sắc và phù hợp nhất (tỷ lệ chọn lọc 1:3).</w:t>
+        <w:t>Thuê và duyệt kịch bản MC: Tuyển chọn MC chuyên nghiệp tại Hải Phòng, biên soạn MC Script chi tiết và brief luật chơi.</w:t>
+      </w:r>
+    </w:p>
+    <w:p>
+      <w:pPr>
+        <w:spacing w:before="160" w:after="80"/>
+      </w:pPr>
+      <w:r>
+        <w:rPr>
+          <w:b/>
+          <w:color w:val="B42846"/>
+        </w:rPr>
+        <w:t>GIAI ĐOẠN 2: TRUYỀN THÔNG &amp; TUYỂN SINH (Tuần 3 - Tuần 4)</w:t>
       </w:r>
     </w:p>
     <w:p>
@@ -803,7 +775,7 @@
         <w:t xml:space="preserve">☐  </w:t>
       </w:r>
       <w:r>
-        <w:t>Gọi điện xác nhận thông tin và thẩm định thái độ của ứng viên.</w:t>
+        <w:t>Triển khai tuyến bài truyền thông gồm 4-5 bài viết chất lượng cao đăng tải trên Zalo OA/Zalo Group và Fanpage.</w:t>
       </w:r>
     </w:p>
     <w:p>
@@ -818,7 +790,7 @@
         <w:t xml:space="preserve">☐  </w:t>
       </w:r>
       <w:r>
-        <w:t>Thu phí đặt chỗ 100% (499k hoặc 690k) để cam kết không hủy lịch sát giờ.</w:t>
+        <w:t>Đăng bài Teasing khơi gợi sự tò mò -&gt; Công bố sự kiện &amp; đối tác Vang My -&gt; Giải thích quy trình &amp; tính bảo mật -&gt; Kêu gọi hành động (CTA) -&gt; Last call khích lệ đóng phí.</w:t>
       </w:r>
     </w:p>
     <w:p>
@@ -833,7 +805,52 @@
         <w:t xml:space="preserve">☐  </w:t>
       </w:r>
       <w:r>
-        <w:t>Thực hiện Pre-matching: Sắp xếp 10 cặp đôi tương thích nhất ngồi đối diện nhau ở lượt đầu tiên.</w:t>
+        <w:t>Tiếp nhận đơn đăng ký trên Google Sheet, sàng lọc hồ sơ theo bộ tiêu chí chất lượng.</w:t>
+      </w:r>
+    </w:p>
+    <w:p>
+      <w:pPr>
+        <w:spacing w:after="60"/>
+        <w:ind w:left="360"/>
+      </w:pPr>
+      <w:r>
+        <w:rPr>
+          <w:rFonts w:ascii="Times New Roman" w:hAnsi="Times New Roman"/>
+        </w:rPr>
+        <w:t xml:space="preserve">☐  </w:t>
+      </w:r>
+      <w:r>
+        <w:t>Gọi điện thẩm định thái độ ứng viên (telesale phỏng vấn ngắn) và gửi thông tin hướng dẫn thanh toán trước 100%.</w:t>
+      </w:r>
+    </w:p>
+    <w:p>
+      <w:pPr>
+        <w:spacing w:after="60"/>
+        <w:ind w:left="360"/>
+      </w:pPr>
+      <w:r>
+        <w:rPr>
+          <w:rFonts w:ascii="Times New Roman" w:hAnsi="Times New Roman"/>
+        </w:rPr>
+        <w:t xml:space="preserve">☐  </w:t>
+      </w:r>
+      <w:r>
+        <w:t>Chốt danh sách 20 khách hàng chính thức (10 Nam &amp; 10 Nữ) đã đóng phí và sắp xếp danh sách chờ (Waiting list).</w:t>
+      </w:r>
+    </w:p>
+    <w:p>
+      <w:pPr>
+        <w:spacing w:after="60"/>
+        <w:ind w:left="360"/>
+      </w:pPr>
+      <w:r>
+        <w:rPr>
+          <w:rFonts w:ascii="Times New Roman" w:hAnsi="Times New Roman"/>
+        </w:rPr>
+        <w:t xml:space="preserve">☐  </w:t>
+      </w:r>
+      <w:r>
+        <w:t>Thực hiện Pre-matching: Xếp cặp đôi tương thích nhất ngồi đối diện nhau ở lượt đầu dựa trên khảo sát tính cách.</w:t>
       </w:r>
     </w:p>
     <w:p>
@@ -860,7 +877,7 @@
         <w:t xml:space="preserve">☐  </w:t>
       </w:r>
       <w:r>
-        <w:t>Set up 10 bàn đôi đảm bảo khoảng cách riêng tư tối thiểu 1.5m - 2m. Đặt nến thơm, hoa nhỏ và Prompt Card.</w:t>
+        <w:t>Set up không gian trước giờ G 2 tiếng tại Nhà hàng Vang My (hoa bàn, nến, Prompt Cards, bàn check-in).</w:t>
       </w:r>
     </w:p>
     <w:p>
@@ -875,7 +892,7 @@
         <w:t xml:space="preserve">☐  </w:t>
       </w:r>
       <w:r>
-        <w:t>Họp nhanh đội ngũ vận hành tinh gọn: 1 MC/Host chính và 1 điều phối viên hỗ trợ check-in kiêm chạy việc.</w:t>
+        <w:t>Kiểm tra kỹ thuật: Hệ thống âm thanh, micro, nhạc nền (Lofi/Jazz) và ánh sáng ấm cúng lãng mạn.</w:t>
       </w:r>
     </w:p>
     <w:p>
@@ -890,7 +907,7 @@
         <w:t xml:space="preserve">☐  </w:t>
       </w:r>
       <w:r>
-        <w:t>Đón khách, phát số báo danh bí mật, hướng dẫn chỗ ngồi.</w:t>
+        <w:t>Briefing đội ngũ vận hành tinh gọn: 1 MC chính và 1 điều phối viên đón khách/xoay bàn.</w:t>
       </w:r>
     </w:p>
     <w:p>
@@ -905,7 +922,7 @@
         <w:t xml:space="preserve">☐  </w:t>
       </w:r>
       <w:r>
-        <w:t>MC dẫn game phá băng ngắn (10-15 phút) giúp khách giải tỏa căng thẳng.</w:t>
+        <w:t>Đón khách, check-in bảo mật, phát số báo danh bí mật, welcome drink và hướng dẫn chỗ ngồi.</w:t>
       </w:r>
     </w:p>
     <w:p>
@@ -920,7 +937,7 @@
         <w:t xml:space="preserve">☐  </w:t>
       </w:r>
       <w:r>
-        <w:t>Tiến hành Speed Dating: 10 lượt xoay bàn (mỗi lượt 7-8 phút, tổng 75-80 phút). Nam di chuyển xoay vòng, nữ ngồi cố định.</w:t>
+        <w:t>MC dẫn dắt game phá băng ngắn (10-15 phút) giúp giải tỏa căng thẳng.</w:t>
       </w:r>
     </w:p>
     <w:p>
@@ -935,19 +952,7 @@
         <w:t xml:space="preserve">☐  </w:t>
       </w:r>
       <w:r>
-        <w:t>Thu lại Match Card bí mật cuối buổi và trao quà tặng lưu niệm tinh tế kèm thiệp cảm ơn.</w:t>
-      </w:r>
-    </w:p>
-    <w:p>
-      <w:pPr>
-        <w:spacing w:before="160" w:after="80"/>
-      </w:pPr>
-      <w:r>
-        <w:rPr>
-          <w:b/>
-          <w:color w:val="B42846"/>
-        </w:rPr>
-        <w:t>GIAI ĐOẠN 4: HẬU SỰ KIỆN (Post-event)</w:t>
+        <w:t>Vận hành Speed Dating: 10 lượt xoay bàn (mỗi lượt 7 phút, nam di chuyển, nữ ngồi cố định). Teabreak giữa giờ.</w:t>
       </w:r>
     </w:p>
     <w:p>
@@ -962,7 +967,19 @@
         <w:t xml:space="preserve">☐  </w:t>
       </w:r>
       <w:r>
-        <w:t>Đối chiếu Match Card tìm cặp đôi trùng khớp (Double Match) ngay trong đêm diễn ra sự kiện.</w:t>
+        <w:t>Thu lại Match Card bí mật cuối buổi, MC phát biểu cảm ơn và phát quà lưu niệm tinh tế kèm thiệp viết tay.</w:t>
+      </w:r>
+    </w:p>
+    <w:p>
+      <w:pPr>
+        <w:spacing w:before="160" w:after="80"/>
+      </w:pPr>
+      <w:r>
+        <w:rPr>
+          <w:b/>
+          <w:color w:val="B42846"/>
+        </w:rPr>
+        <w:t>GIAI ĐOẠN 4: HẬU SỰ KIỆN &amp; QUY TRÌNH CRM (Post-event &amp; CRM)</w:t>
       </w:r>
     </w:p>
     <w:p>
@@ -977,7 +994,7 @@
         <w:t xml:space="preserve">☐  </w:t>
       </w:r>
       <w:r>
-        <w:t>Gửi thông báo kết quả qua Zalo/Email cá nhân cho khách hàng trong vòng 24h.</w:t>
+        <w:t>Đối chiếu chéo Match Card tìm cặp trùng khớp (Double Match) ngay trong tối diễn ra sự kiện.</w:t>
       </w:r>
     </w:p>
     <w:p>
@@ -992,7 +1009,7 @@
         <w:t xml:space="preserve">☐  </w:t>
       </w:r>
       <w:r>
-        <w:t>Chia sẻ thông tin liên lạc (SĐT/Zalo) cho các cặp đôi match thành công để họ tự hẹn gặp.</w:t>
+        <w:t>Gửi thông báo kết quả cá nhân trong 24h qua Zalo/Email: cung cấp contact đối phương nếu match, gửi lời cảm ơn và hẹn số sau nếu chưa match.</w:t>
       </w:r>
     </w:p>
     <w:p>
@@ -1007,7 +1024,7 @@
         <w:t xml:space="preserve">☐  </w:t>
       </w:r>
       <w:r>
-        <w:t>Hỗ trợ tư vấn, góp ý tinh tế về cách giao tiếp/trang phục cho những khách hàng chưa match thành công.</w:t>
+        <w:t>Gửi Google Form khảo sát chất lượng dịch vụ (đánh giá địa điểm Vang My, F&amp;B, MC, khâu tổ chức) để cải thiện.</w:t>
       </w:r>
     </w:p>
     <w:p>
@@ -1022,7 +1039,52 @@
         <w:t xml:space="preserve">☐  </w:t>
       </w:r>
       <w:r>
-        <w:t>Gửi form khảo sát chất lượng dịch vụ và chốt báo cáo tài chính thực tế của sự kiện.</w:t>
+        <w:t>Đồng bộ hóa dữ liệu khách hàng vào hệ thống CRM (Excel/Airtable), gán tag phân loại tình trạng (HP-Pilot, Matched, Waiting List, Hướng nội/ngoại).</w:t>
+      </w:r>
+    </w:p>
+    <w:p>
+      <w:pPr>
+        <w:spacing w:after="60"/>
+        <w:ind w:left="360"/>
+      </w:pPr>
+      <w:r>
+        <w:rPr>
+          <w:rFonts w:ascii="Times New Roman" w:hAnsi="Times New Roman"/>
+        </w:rPr>
+        <w:t xml:space="preserve">☐  </w:t>
+      </w:r>
+      <w:r>
+        <w:t>Triển khai kịch bản CSKH sau sự kiện: Nhóm Matched (hỏi thăm, tặng voucher Vang My cho lần hẹn 2), Nhóm Not Matched (gửi tips hẹn hò, giới thiệu sự kiện tiếp theo).</w:t>
+      </w:r>
+    </w:p>
+    <w:p>
+      <w:pPr>
+        <w:spacing w:after="60"/>
+        <w:ind w:left="360"/>
+      </w:pPr>
+      <w:r>
+        <w:rPr>
+          <w:rFonts w:ascii="Times New Roman" w:hAnsi="Times New Roman"/>
+        </w:rPr>
+        <w:t xml:space="preserve">☐  </w:t>
+      </w:r>
+      <w:r>
+        <w:t>Re-marketing lâu dài qua Zalo OA &amp; Email chăm sóc định kỳ hàng tháng.</w:t>
+      </w:r>
+    </w:p>
+    <w:p>
+      <w:pPr>
+        <w:spacing w:after="60"/>
+        <w:ind w:left="360"/>
+      </w:pPr>
+      <w:r>
+        <w:rPr>
+          <w:rFonts w:ascii="Times New Roman" w:hAnsi="Times New Roman"/>
+        </w:rPr>
+        <w:t xml:space="preserve">☐  </w:t>
+      </w:r>
+      <w:r>
+        <w:t>Tổng kết báo cáo tài chính (Doanh thu STK BTC vs Chi phí Vang My, MC, in ấn, quà tặng) và họp rút kinh nghiệm.</w:t>
       </w:r>
     </w:p>
     <w:sectPr>

</xml_diff>